<commit_message>
feat: numero_proyecto + calculos actualizados + templates
</commit_message>
<xml_diff>
--- a/app/templates/laureles/AMARILLO.docx
+++ b/app/templates/laureles/AMARILLO.docx
@@ -172,7 +172,27 @@
           <w:szCs w:val="18"/>
           <w:lang w:val="es-ES_tradnl"/>
         </w:rPr>
-        <w:t xml:space="preserve">, QUIEN ME MANIFESTO SER DE NACIONALIDAD PERUANA, IDENTIFICADO CON DOCUMENTO NACIONAL DE IDENTIDAD NUMERO 45234161, DE ESTADO CIVIL SOLTERO, DE PROFESION U OCUPACION: EMPRESARIO, CON DOMICILIO EN LA AV. 12 DE NOVIEMBRE 1596, DISTRITO DE FLORENCIA DE MORA, PROVINCIA DE TRUJILLO, DEPARTAMENTO DE LA LIBERTAD, </w:t>
+        <w:t xml:space="preserve">, QUIEN ME MANIFESTO SER DE NACIONALIDAD PERUANA, IDENTIFICADO CON DOCUMENTO NACIONAL DE IDENTIDAD NUMERO 45234161, DE ESTADO CIVIL SOLTERO, DE PROFESION U OCUPACION: EMPRESARIO, CON </w:t>
+      </w:r>
+      <w:r>
+        <w:rPr>
+          <w:rFonts w:ascii="Arial" w:hAnsi="Arial" w:cs="Arial"/>
+          <w:color w:val="000000"/>
+          <w:sz w:val="18"/>
+          <w:szCs w:val="18"/>
+          <w:lang w:val="es-ES_tradnl"/>
+        </w:rPr>
+        <w:t>DOMICILIO EN LA PARCELA A1, CON U.C. 0775, LA MERCED III, DEL DISTRITO DE LAREDO, PROVINCIA DE TRUJILLO, DEPARTAMENTO DE LA LIBERTAD</w:t>
+      </w:r>
+      <w:r>
+        <w:rPr>
+          <w:rFonts w:ascii="Arial" w:hAnsi="Arial" w:cs="Arial"/>
+          <w:color w:val="000000"/>
+          <w:sz w:val="18"/>
+          <w:szCs w:val="18"/>
+          <w:lang w:val="es-ES_tradnl"/>
+        </w:rPr>
+        <w:t>, QUIEN</w:t>
       </w:r>
       <w:r>
         <w:rPr>
@@ -181,7 +201,7 @@
           <w:szCs w:val="18"/>
           <w:lang w:val="es-PE"/>
         </w:rPr>
-        <w:t xml:space="preserve">QUIEN INTERVIENE EN CALIDAD DE GERENTE GENERAL DE LA EMPRESA DENOMINADA </w:t>
+        <w:t xml:space="preserve"> INTERVIENE EN CALIDAD DE GERENTE GENERAL DE LA EMPRESA DENOMINADA </w:t>
       </w:r>
       <w:r>
         <w:rPr>
@@ -229,29 +249,27 @@
           <w:szCs w:val="18"/>
           <w:lang w:val="es-ES_tradnl"/>
         </w:rPr>
-        <w:t xml:space="preserve">20609784271, CON DOMICILIO EN EL JR. AYACUCHO </w:t>
-      </w:r>
-      <w:proofErr w:type="spellStart"/>
-      <w:r>
-        <w:rPr>
-          <w:rFonts w:ascii="Arial" w:hAnsi="Arial" w:cs="Arial"/>
-          <w:bCs/>
+        <w:t>20609784271, CON DOMICILIO EN EL JR. AYACUCHO N° 513, INT. 205 CENTRO HISTÓRICO, DISTRITO Y PROVINCIA DE TRUJILLO, DEPARTAMENTO DE LA LIBERTAD</w:t>
+      </w:r>
+      <w:r>
+        <w:rPr>
+          <w:rFonts w:ascii="Arial" w:hAnsi="Arial" w:cs="Arial"/>
           <w:sz w:val="18"/>
           <w:szCs w:val="18"/>
           <w:lang w:val="es-ES_tradnl"/>
         </w:rPr>
-        <w:t>N°</w:t>
-      </w:r>
-      <w:proofErr w:type="spellEnd"/>
-      <w:r>
-        <w:rPr>
-          <w:rFonts w:ascii="Arial" w:hAnsi="Arial" w:cs="Arial"/>
+        <w:t>,</w:t>
+      </w:r>
+      <w:r>
+        <w:rPr>
+          <w:rFonts w:ascii="Arial" w:hAnsi="Arial" w:cs="Arial"/>
+          <w:b/>
           <w:bCs/>
           <w:sz w:val="18"/>
           <w:szCs w:val="18"/>
           <w:lang w:val="es-ES_tradnl"/>
         </w:rPr>
-        <w:t xml:space="preserve"> 513, INT. 205 CENTRO HISTÓRICO, DISTRITO Y PROVINCIA DE TRUJILLO, DEPARTAMENTO DE LA LIBERTAD</w:t>
+        <w:t xml:space="preserve"> </w:t>
       </w:r>
       <w:r>
         <w:rPr>
@@ -260,47 +278,7 @@
           <w:szCs w:val="18"/>
           <w:lang w:val="es-ES_tradnl"/>
         </w:rPr>
-        <w:t>,</w:t>
-      </w:r>
-      <w:r>
-        <w:rPr>
-          <w:rFonts w:ascii="Arial" w:hAnsi="Arial" w:cs="Arial"/>
-          <w:b/>
-          <w:bCs/>
-          <w:sz w:val="18"/>
-          <w:szCs w:val="18"/>
-          <w:lang w:val="es-ES_tradnl"/>
-        </w:rPr>
-        <w:t xml:space="preserve"> </w:t>
-      </w:r>
-      <w:r>
-        <w:rPr>
-          <w:rFonts w:ascii="Arial" w:hAnsi="Arial" w:cs="Arial"/>
-          <w:sz w:val="18"/>
-          <w:szCs w:val="18"/>
-          <w:lang w:val="es-ES_tradnl"/>
-        </w:rPr>
-        <w:t xml:space="preserve">SEGUN FACULTADES INSCRITAS EN LA PARTIDA REGISTRAL 11486486 DEL REGISTRO DE PERSONAS JURIDICAS DE LA ZONA REGISTRAL </w:t>
-      </w:r>
-      <w:proofErr w:type="spellStart"/>
-      <w:r>
-        <w:rPr>
-          <w:rFonts w:ascii="Arial" w:hAnsi="Arial" w:cs="Arial"/>
-          <w:sz w:val="18"/>
-          <w:szCs w:val="18"/>
-          <w:lang w:val="es-ES_tradnl"/>
-        </w:rPr>
-        <w:t>N°</w:t>
-      </w:r>
-      <w:proofErr w:type="spellEnd"/>
-      <w:r>
-        <w:rPr>
-          <w:rFonts w:ascii="Arial" w:hAnsi="Arial" w:cs="Arial"/>
-          <w:sz w:val="18"/>
-          <w:szCs w:val="18"/>
-          <w:lang w:val="es-ES_tradnl"/>
-        </w:rPr>
-        <w:t xml:space="preserve"> V - SEDE TRUJILLO, OFICINA REGISTRAL DE TRUJILLO</w:t>
+        <w:t>SEGUN FACULTADES INSCRITAS EN LA PARTIDA REGISTRAL 11486486 DEL REGISTRO DE PERSONAS JURIDICAS DE LA ZONA REGISTRAL N° V - SEDE TRUJILLO, OFICINA REGISTRAL DE TRUJILLO</w:t>
       </w:r>
       <w:r>
         <w:rPr>
@@ -386,7 +364,16 @@
           <w:sz w:val="18"/>
           <w:szCs w:val="18"/>
         </w:rPr>
-        <w:t xml:space="preserve">, QUIEN ME MANIFESTO SER DE NACIONALIDAD: PERUANA; </w:t>
+        <w:t xml:space="preserve">, QUIEN ME MANIFESTO SER DE NACIONALIDAD: PERUANA; «IDENT» CON DOCUMENTO NACIONAL DE IDENTIDAD NUMERO: </w:t>
+      </w:r>
+      <w:r>
+        <w:rPr>
+          <w:rFonts w:ascii="Arial" w:hAnsi="Arial" w:cs="Arial"/>
+          <w:sz w:val="18"/>
+          <w:szCs w:val="18"/>
+          <w:lang w:val="es-ES_tradnl"/>
+        </w:rPr>
+        <w:t>«DNI»</w:t>
       </w:r>
       <w:r>
         <w:rPr>
@@ -396,122 +383,33 @@
           <w:sz w:val="18"/>
           <w:szCs w:val="18"/>
         </w:rPr>
-        <w:t>«_IDENT»</w:t>
-      </w:r>
-      <w:r>
-        <w:rPr>
-          <w:rFonts w:ascii="Arial" w:hAnsi="Arial" w:cs="Arial"/>
-          <w:bCs/>
-          <w:color w:val="000000"/>
-          <w:sz w:val="18"/>
-          <w:szCs w:val="18"/>
-        </w:rPr>
-        <w:t xml:space="preserve"> CON DOCUMENTO NACIONAL DE IDENTIDAD NUMERO: </w:t>
-      </w:r>
-      <w:r>
-        <w:rPr>
-          <w:rFonts w:ascii="Arial" w:hAnsi="Arial" w:cs="Arial"/>
-          <w:sz w:val="18"/>
-          <w:szCs w:val="18"/>
-          <w:lang w:val="es-ES_tradnl"/>
-        </w:rPr>
-        <w:t>«_DNI»</w:t>
-      </w:r>
-      <w:r>
-        <w:rPr>
-          <w:rFonts w:ascii="Arial" w:hAnsi="Arial" w:cs="Arial"/>
-          <w:bCs/>
-          <w:color w:val="000000"/>
-          <w:sz w:val="18"/>
-          <w:szCs w:val="18"/>
-        </w:rPr>
-        <w:t xml:space="preserve">; DE ESTADO CIVIL: </w:t>
-      </w:r>
-      <w:r>
-        <w:rPr>
-          <w:rFonts w:ascii="Arial" w:hAnsi="Arial" w:cs="Arial"/>
-          <w:bCs/>
-          <w:color w:val="000000"/>
-          <w:sz w:val="18"/>
-          <w:szCs w:val="18"/>
-        </w:rPr>
-        <w:t>«_ESTADO_CIVIL»</w:t>
-      </w:r>
-      <w:r>
-        <w:rPr>
-          <w:rFonts w:ascii="Arial" w:hAnsi="Arial" w:cs="Arial"/>
-          <w:bCs/>
-          <w:color w:val="000000"/>
-          <w:sz w:val="18"/>
-          <w:szCs w:val="18"/>
-        </w:rPr>
-        <w:t xml:space="preserve">; DE PROFESION U OCUPACION: </w:t>
-      </w:r>
-      <w:r>
-        <w:rPr>
-          <w:rFonts w:ascii="Arial" w:hAnsi="Arial" w:cs="Arial"/>
-          <w:bCs/>
-          <w:color w:val="000000"/>
-          <w:sz w:val="18"/>
-          <w:szCs w:val="18"/>
-        </w:rPr>
-        <w:t>«OCUPACION1»</w:t>
-      </w:r>
-      <w:r>
-        <w:rPr>
-          <w:rFonts w:ascii="Arial" w:hAnsi="Arial" w:cs="Arial"/>
-          <w:bCs/>
-          <w:color w:val="000000"/>
-          <w:sz w:val="18"/>
-          <w:szCs w:val="18"/>
-        </w:rPr>
-        <w:t xml:space="preserve">; CON DOMICILIO EN </w:t>
-      </w:r>
-      <w:r>
-        <w:rPr>
-          <w:rFonts w:ascii="Arial" w:hAnsi="Arial" w:cs="Arial"/>
-          <w:bCs/>
-          <w:color w:val="000000"/>
-          <w:sz w:val="18"/>
-          <w:szCs w:val="18"/>
-        </w:rPr>
-        <w:t>«DIRECCION1»</w:t>
-      </w:r>
-      <w:r>
-        <w:rPr>
-          <w:rFonts w:ascii="Arial" w:hAnsi="Arial" w:cs="Arial"/>
-          <w:sz w:val="18"/>
-          <w:szCs w:val="18"/>
-        </w:rPr>
-        <w:t xml:space="preserve">; A QUIEN EN ADELANTE SE LES DENOMINARA </w:t>
-      </w:r>
-      <w:bookmarkStart w:id="0" w:name="_Hlk208824248"/>
-      <w:r>
-        <w:rPr>
-          <w:rFonts w:ascii="Arial" w:hAnsi="Arial" w:cs="Arial"/>
-          <w:b/>
-          <w:bCs/>
-          <w:sz w:val="18"/>
-          <w:szCs w:val="18"/>
-        </w:rPr>
-        <w:t>«_PROMT»</w:t>
-      </w:r>
-      <w:bookmarkEnd w:id="0"/>
-      <w:r>
-        <w:rPr>
-          <w:rFonts w:ascii="Arial" w:hAnsi="Arial" w:cs="Arial"/>
-          <w:sz w:val="18"/>
-          <w:szCs w:val="18"/>
-        </w:rPr>
-        <w:t>;</w:t>
-      </w:r>
-      <w:r>
-        <w:rPr>
-          <w:rFonts w:ascii="Arial" w:hAnsi="Arial" w:cs="Arial"/>
-          <w:sz w:val="18"/>
-          <w:szCs w:val="18"/>
-        </w:rPr>
-        <w:t xml:space="preserve"> EN LOS TÉRMINOS Y CONDICIONES SIGUIENTES: </w:t>
+        <w:t>; DE ESTADO CIVIL: «ESTADO_CIVIL»; DE PROFESION U OCUPACION: «OCUPACION»; CON DOMICILIO EN «DIRECCION»</w:t>
+      </w:r>
+      <w:r>
+        <w:rPr>
+          <w:rFonts w:ascii="Arial" w:hAnsi="Arial" w:cs="Arial"/>
+          <w:sz w:val="18"/>
+          <w:szCs w:val="18"/>
+        </w:rPr>
+        <w:t xml:space="preserve">; A QUIEN EN ADELANTE SE LE DENOMINARA </w:t>
+      </w:r>
+      <w:r>
+        <w:rPr>
+          <w:rFonts w:ascii="Arial" w:hAnsi="Arial" w:cs="Arial"/>
+          <w:b/>
+          <w:bCs/>
+          <w:sz w:val="18"/>
+          <w:szCs w:val="18"/>
+        </w:rPr>
+        <w:t>«COMPRADOR»</w:t>
+      </w:r>
+      <w:r>
+        <w:rPr>
+          <w:rFonts w:ascii="Arial" w:hAnsi="Arial" w:cs="Arial"/>
+          <w:sz w:val="18"/>
+          <w:szCs w:val="18"/>
+        </w:rPr>
+        <w:t>; EN LOS TÉRMINOS Y CONDICIONES SIGUIENTES:</w:t>
       </w:r>
     </w:p>
     <w:p>
@@ -620,27 +518,7 @@
           <w:sz w:val="18"/>
           <w:szCs w:val="18"/>
         </w:rPr>
-        <w:t xml:space="preserve">PARTIDA ELECTRONICA </w:t>
-      </w:r>
-      <w:proofErr w:type="spellStart"/>
-      <w:r>
-        <w:rPr>
-          <w:rFonts w:ascii="Arial" w:hAnsi="Arial" w:cs="Arial"/>
-          <w:b/>
-          <w:sz w:val="18"/>
-          <w:szCs w:val="18"/>
-        </w:rPr>
-        <w:t>Nº</w:t>
-      </w:r>
-      <w:proofErr w:type="spellEnd"/>
-      <w:r>
-        <w:rPr>
-          <w:rFonts w:ascii="Arial" w:hAnsi="Arial" w:cs="Arial"/>
-          <w:b/>
-          <w:sz w:val="18"/>
-          <w:szCs w:val="18"/>
-        </w:rPr>
-        <w:t xml:space="preserve"> 11095526</w:t>
+        <w:t>PARTIDA ELECTRONICA Nº 11095526</w:t>
       </w:r>
       <w:r>
         <w:rPr>
@@ -665,25 +543,7 @@
           <w:sz w:val="18"/>
           <w:szCs w:val="18"/>
         </w:rPr>
-        <w:t xml:space="preserve">DEL REGISTRO DE PREDIOS DE LA ZONA REGISTRAL </w:t>
-      </w:r>
-      <w:proofErr w:type="spellStart"/>
-      <w:r>
-        <w:rPr>
-          <w:rFonts w:ascii="Arial" w:hAnsi="Arial" w:cs="Arial"/>
-          <w:sz w:val="18"/>
-          <w:szCs w:val="18"/>
-        </w:rPr>
-        <w:t>Nº</w:t>
-      </w:r>
-      <w:proofErr w:type="spellEnd"/>
-      <w:r>
-        <w:rPr>
-          <w:rFonts w:ascii="Arial" w:hAnsi="Arial" w:cs="Arial"/>
-          <w:sz w:val="18"/>
-          <w:szCs w:val="18"/>
-        </w:rPr>
-        <w:t xml:space="preserve"> V – SEDE TRUJILLO, OFICINA REGISTRAL DE TRUJILLO</w:t>
+        <w:t>DEL REGISTRO DE PREDIOS DE LA ZONA REGISTRAL Nº V – SEDE TRUJILLO, OFICINA REGISTRAL DE TRUJILLO</w:t>
       </w:r>
       <w:r>
         <w:rPr>
@@ -835,15 +695,7 @@
           <w:sz w:val="18"/>
           <w:szCs w:val="18"/>
         </w:rPr>
-        <w:t>CUYAS</w:t>
-      </w:r>
-      <w:r>
-        <w:rPr>
-          <w:rFonts w:ascii="Arial" w:hAnsi="Arial" w:cs="Arial"/>
-          <w:sz w:val="18"/>
-          <w:szCs w:val="18"/>
-        </w:rPr>
-        <w:t xml:space="preserve"> CARACTERISTICAS ESTAN SEÑALADAS EN LA MEMORIA DESCRIPTIVA QUE OBRA ADJUNTA AL PRESENTE CONTRATO COMO ANEXO 01; QUE ES MATERIA DE VENTA COMO BIEN FUTURO, Y QUE EN ADELANTE SERÁ DENOMINADO COMO </w:t>
+        <w:t xml:space="preserve">CUYAS CARACTERISTICAS ESTAN SEÑALADAS EN LA MEMORIA DESCRIPTIVA AL CUAL TIENE LIBRE ACCESO «COMPRADOR»; QUE ES MATERIA DE VENTA COMO BIEN FUTURO, Y QUE EN ADELANTE SERÁ DENOMINADO COMO </w:t>
       </w:r>
       <w:r>
         <w:rPr>
@@ -889,7 +741,23 @@
           <w:sz w:val="18"/>
           <w:szCs w:val="18"/>
         </w:rPr>
-        <w:t>AMBAS PARTES CELEBRAN ESTE CONTRATO DE COMPRAVENTA DE BIEN FUTURO, CONFORME A LO ESTABLECIDO POR EL ARTÍCULO 1534 DEL CÓDIGO CIVIL, RESPECTO DE EL INMUEBLE ANTES MENCIONADO, EL MISMO QUE SERA</w:t>
+        <w:t xml:space="preserve">AMBAS PARTES CELEBRAN ESTE CONTRATO DE COMPRAVENTA DE BIEN FUTURO, CONFORME A LO ESTABLECIDO POR EL ARTÍCULO </w:t>
+      </w:r>
+      <w:r>
+        <w:rPr>
+          <w:rFonts w:ascii="Arial" w:hAnsi="Arial" w:cs="Arial"/>
+          <w:sz w:val="18"/>
+          <w:szCs w:val="18"/>
+        </w:rPr>
+        <w:t xml:space="preserve">1534° </w:t>
+      </w:r>
+      <w:r>
+        <w:rPr>
+          <w:rFonts w:ascii="Arial" w:hAnsi="Arial" w:cs="Arial"/>
+          <w:sz w:val="18"/>
+          <w:szCs w:val="18"/>
+        </w:rPr>
+        <w:t>DEL CÓDIGO CIVIL, RESPECTO DE EL INMUEBLE ANTES MENCIONADO, EL MISMO QUE SERA</w:t>
       </w:r>
       <w:r>
         <w:rPr>
@@ -1039,33 +907,29 @@
           <w:bCs/>
           <w:sz w:val="18"/>
           <w:szCs w:val="18"/>
-        </w:rPr>
-        <w:t>SEGUNDA</w:t>
-      </w:r>
-      <w:r>
-        <w:rPr>
-          <w:rFonts w:ascii="Arial" w:hAnsi="Arial" w:cs="Arial"/>
-          <w:sz w:val="18"/>
-          <w:szCs w:val="18"/>
-        </w:rPr>
-        <w:t>.-</w:t>
+          <w:lang w:eastAsia="en-US"/>
+        </w:rPr>
+        <w:t>SEGUNDA.-</w:t>
       </w:r>
       <w:proofErr w:type="gramEnd"/>
       <w:r>
         <w:rPr>
           <w:rFonts w:ascii="Arial" w:hAnsi="Arial" w:cs="Arial"/>
-          <w:sz w:val="18"/>
-          <w:szCs w:val="18"/>
-        </w:rPr>
-        <w:t xml:space="preserve"> SOBRE LA CELEBRACIÓN DEL CONTRATO PREPARATORIO DE COMPRAVENTA DE BIEN FUTURO.</w:t>
-      </w:r>
-      <w:r>
-        <w:rPr>
-          <w:rFonts w:ascii="Arial" w:hAnsi="Arial" w:cs="Arial"/>
-          <w:sz w:val="18"/>
-          <w:szCs w:val="18"/>
+          <w:b/>
+          <w:bCs/>
+          <w:sz w:val="18"/>
+          <w:szCs w:val="18"/>
+          <w:lang w:eastAsia="en-US"/>
         </w:rPr>
         <w:t xml:space="preserve"> </w:t>
+      </w:r>
+      <w:r>
+        <w:rPr>
+          <w:rFonts w:ascii="Arial" w:hAnsi="Arial" w:cs="Arial"/>
+          <w:sz w:val="18"/>
+          <w:szCs w:val="18"/>
+        </w:rPr>
+        <w:t xml:space="preserve">SOBRE LA CELEBRACIÓN DEL CONTRATO PREPARATORIO DE COMPRAVENTA DE BIEN FUTURO. </w:t>
       </w:r>
     </w:p>
     <w:p>
@@ -1074,74 +938,20 @@
         <w:spacing w:before="0" w:beforeAutospacing="0" w:after="0" w:afterAutospacing="0" w:line="324" w:lineRule="auto"/>
         <w:jc w:val="both"/>
         <w:rPr>
-          <w:rFonts w:ascii="Arial" w:hAnsi="Arial" w:cs="Arial"/>
-          <w:sz w:val="18"/>
-          <w:szCs w:val="18"/>
-        </w:rPr>
-      </w:pPr>
-      <w:r>
-        <w:rPr>
-          <w:rFonts w:ascii="Arial" w:hAnsi="Arial" w:cs="Arial"/>
-          <w:sz w:val="18"/>
-          <w:szCs w:val="18"/>
-        </w:rPr>
-        <w:t xml:space="preserve">LAS PARTES RECONOCEN Y DECLARAN QUE </w:t>
-      </w:r>
-      <w:r>
-        <w:rPr>
-          <w:rFonts w:ascii="Arial" w:hAnsi="Arial" w:cs="Arial"/>
-          <w:sz w:val="18"/>
-          <w:szCs w:val="18"/>
-        </w:rPr>
-        <w:t>ANTERIOR A ESTA MINUTA,</w:t>
-      </w:r>
-      <w:r>
-        <w:rPr>
-          <w:rFonts w:ascii="Arial" w:hAnsi="Arial" w:cs="Arial"/>
-          <w:sz w:val="18"/>
-          <w:szCs w:val="18"/>
-        </w:rPr>
-        <w:t xml:space="preserve"> CELEBRARON Y SUSCRIBIERON UN CONTRATO </w:t>
-      </w:r>
-      <w:r>
-        <w:rPr>
-          <w:rFonts w:ascii="Arial" w:hAnsi="Arial" w:cs="Arial"/>
-          <w:sz w:val="18"/>
-          <w:szCs w:val="18"/>
-        </w:rPr>
-        <w:t>DE PROMESA DE VENTA</w:t>
-      </w:r>
-      <w:r>
-        <w:rPr>
-          <w:rFonts w:ascii="Arial" w:hAnsi="Arial" w:cs="Arial"/>
-          <w:sz w:val="18"/>
-          <w:szCs w:val="18"/>
-        </w:rPr>
-        <w:t xml:space="preserve">, EN CONSECUENCIA, CON LA CELEBRACION DEL PRESENTE CONTRATO DEFINITIVO DE COMPRAVENTA, DENTRO DEL PLAZO PACTADO, SE ESTA CUMPLIENDO CON LOS COMPROMISOS Y ACUERDOS CONTENIDOS EN EL MENCIONADO CONTRATO </w:t>
-      </w:r>
-      <w:r>
-        <w:rPr>
-          <w:rFonts w:ascii="Arial" w:hAnsi="Arial" w:cs="Arial"/>
-          <w:sz w:val="18"/>
-          <w:szCs w:val="18"/>
-        </w:rPr>
-        <w:t>PRIVADO DE PROMESA DE VENTA</w:t>
-      </w:r>
-      <w:r>
-        <w:rPr>
-          <w:rFonts w:ascii="Arial" w:hAnsi="Arial" w:cs="Arial"/>
-          <w:sz w:val="18"/>
-          <w:szCs w:val="18"/>
-        </w:rPr>
-        <w:t>.</w:t>
-      </w:r>
-      <w:r>
-        <w:rPr>
-          <w:rFonts w:ascii="Arial" w:hAnsi="Arial" w:cs="Arial"/>
-          <w:sz w:val="18"/>
-          <w:szCs w:val="18"/>
-        </w:rPr>
-        <w:t xml:space="preserve"> </w:t>
+          <w:rFonts w:ascii="Arial" w:eastAsia="Times New Roman" w:hAnsi="Arial" w:cs="Arial"/>
+          <w:sz w:val="18"/>
+          <w:szCs w:val="18"/>
+          <w:lang w:eastAsia="en-US"/>
+        </w:rPr>
+      </w:pPr>
+      <w:r>
+        <w:rPr>
+          <w:rFonts w:ascii="Arial" w:eastAsia="Times New Roman" w:hAnsi="Arial" w:cs="Arial"/>
+          <w:sz w:val="18"/>
+          <w:szCs w:val="18"/>
+          <w:lang w:eastAsia="en-US"/>
+        </w:rPr>
+        <w:t>LAS PARTES DECLARAN QUE, CON ANTERIORIDAD A LA SUSCRIPCIÓN DEL PRESENTE CONTRATO, EL COMPRADOR SUSCRIBIÓ CON LA VENDEDORA UNA FICHA DE SEPARACIÓN Y, DE SER EL CASO, UN CONTRATO DE PROMESA DE VENTA RESPECTO DEL BIEN MATERIA DE LA PRESENTE COMPRAVENTA.</w:t>
       </w:r>
     </w:p>
     <w:p>
@@ -1150,42 +960,20 @@
         <w:spacing w:before="0" w:beforeAutospacing="0" w:after="0" w:afterAutospacing="0" w:line="324" w:lineRule="auto"/>
         <w:jc w:val="both"/>
         <w:rPr>
-          <w:rFonts w:ascii="Arial" w:hAnsi="Arial" w:cs="Arial"/>
-          <w:sz w:val="18"/>
-          <w:szCs w:val="18"/>
-        </w:rPr>
-      </w:pPr>
-      <w:r>
-        <w:rPr>
-          <w:rFonts w:ascii="Arial" w:hAnsi="Arial" w:cs="Arial"/>
-          <w:sz w:val="18"/>
-          <w:szCs w:val="18"/>
-        </w:rPr>
-        <w:t xml:space="preserve">ASIMISMO, LAS PARTES RECONOCEN Y DECLARAN QUE EN CASO DE DISCREPANCIA O DISCONFORMIDAD ENTRE LOS ACUERDOS ADOPTADOS EN EL CONTRATO </w:t>
-      </w:r>
-      <w:r>
-        <w:rPr>
-          <w:rFonts w:ascii="Arial" w:hAnsi="Arial" w:cs="Arial"/>
-          <w:sz w:val="18"/>
-          <w:szCs w:val="18"/>
-        </w:rPr>
-        <w:t>PRIVADO</w:t>
-      </w:r>
-      <w:r>
-        <w:rPr>
-          <w:rFonts w:ascii="Arial" w:hAnsi="Arial" w:cs="Arial"/>
-          <w:sz w:val="18"/>
-          <w:szCs w:val="18"/>
-        </w:rPr>
-        <w:t xml:space="preserve"> Y EL PRESENTE CONTRATO DEFINITIVO, PREVALECEN LOS ACUERDOS DEL CONTRATO DEFINITIVO.</w:t>
-      </w:r>
-      <w:r>
-        <w:rPr>
-          <w:rFonts w:ascii="Arial" w:hAnsi="Arial" w:cs="Arial"/>
-          <w:sz w:val="18"/>
-          <w:szCs w:val="18"/>
-        </w:rPr>
-        <w:t xml:space="preserve"> </w:t>
+          <w:rFonts w:ascii="Arial" w:eastAsia="Times New Roman" w:hAnsi="Arial" w:cs="Arial"/>
+          <w:sz w:val="18"/>
+          <w:szCs w:val="18"/>
+          <w:lang w:eastAsia="en-US"/>
+        </w:rPr>
+      </w:pPr>
+      <w:r>
+        <w:rPr>
+          <w:rFonts w:ascii="Arial" w:eastAsia="Times New Roman" w:hAnsi="Arial" w:cs="Arial"/>
+          <w:sz w:val="18"/>
+          <w:szCs w:val="18"/>
+          <w:lang w:eastAsia="en-US"/>
+        </w:rPr>
+        <w:t>ASIMISMO, LAS PARTES ACUERDAN QUE, EN CASO DE DISCREPANCIA O DISCONFORMIDAD ENTRE LO ESTABLECIDO EN DICHOS DOCUMENTOS Y EL PRESENTE CONTRATO DEFINITIVO DE COMPRAVENTA, PREVALECERÁ LO DISPUESTO EN ESTE ÚLTIMO.</w:t>
       </w:r>
     </w:p>
     <w:p>
@@ -1365,7 +1153,55 @@
           <w:sz w:val="18"/>
           <w:szCs w:val="18"/>
         </w:rPr>
-        <w:t xml:space="preserve">«_AREA» M2 </w:t>
+        <w:t>«AREA» M2 («AREA_TEXTO» METROS CUADRADOS</w:t>
+      </w:r>
+      <w:r>
+        <w:rPr>
+          <w:rFonts w:ascii="Arial" w:hAnsi="Arial" w:cs="Arial"/>
+          <w:b/>
+          <w:bCs/>
+          <w:sz w:val="18"/>
+          <w:szCs w:val="18"/>
+        </w:rPr>
+        <w:t>)</w:t>
+      </w:r>
+      <w:r>
+        <w:rPr>
+          <w:rFonts w:ascii="Arial" w:hAnsi="Arial" w:cs="Arial"/>
+          <w:b/>
+          <w:bCs/>
+          <w:sz w:val="18"/>
+          <w:szCs w:val="18"/>
+        </w:rPr>
+        <w:t xml:space="preserve"> </w:t>
+      </w:r>
+      <w:r>
+        <w:rPr>
+          <w:rFonts w:ascii="Arial" w:hAnsi="Arial" w:cs="Arial"/>
+          <w:sz w:val="18"/>
+          <w:szCs w:val="18"/>
+        </w:rPr>
+        <w:t xml:space="preserve">DEL PROYECTO DENOMINADO </w:t>
+      </w:r>
+      <w:r>
+        <w:rPr>
+          <w:rFonts w:ascii="Arial" w:hAnsi="Arial" w:cs="Arial"/>
+          <w:b/>
+          <w:bCs/>
+          <w:sz w:val="18"/>
+          <w:szCs w:val="18"/>
+        </w:rPr>
+        <w:t>“</w:t>
+      </w:r>
+      <w:r>
+        <w:rPr>
+          <w:rFonts w:ascii="Arial" w:hAnsi="Arial" w:cs="Arial"/>
+          <w:b/>
+          <w:bCs/>
+          <w:sz w:val="18"/>
+          <w:szCs w:val="18"/>
+        </w:rPr>
+        <w:t xml:space="preserve">RESIDENCIAL LOS </w:t>
       </w:r>
       <w:r>
         <w:rPr>
@@ -1376,55 +1212,7 @@
           <w:szCs w:val="18"/>
         </w:rPr>
         <w:lastRenderedPageBreak/>
-        <w:t>(«_AREA_TEXTO» METROS CUADRADOS</w:t>
-      </w:r>
-      <w:r>
-        <w:rPr>
-          <w:rFonts w:ascii="Arial" w:hAnsi="Arial" w:cs="Arial"/>
-          <w:b/>
-          <w:bCs/>
-          <w:sz w:val="18"/>
-          <w:szCs w:val="18"/>
-        </w:rPr>
-        <w:t>)</w:t>
-      </w:r>
-      <w:r>
-        <w:rPr>
-          <w:rFonts w:ascii="Arial" w:hAnsi="Arial" w:cs="Arial"/>
-          <w:b/>
-          <w:bCs/>
-          <w:sz w:val="18"/>
-          <w:szCs w:val="18"/>
-        </w:rPr>
-        <w:t xml:space="preserve"> </w:t>
-      </w:r>
-      <w:r>
-        <w:rPr>
-          <w:rFonts w:ascii="Arial" w:hAnsi="Arial" w:cs="Arial"/>
-          <w:sz w:val="18"/>
-          <w:szCs w:val="18"/>
-        </w:rPr>
-        <w:t xml:space="preserve">DEL PROYECTO DENOMINADO </w:t>
-      </w:r>
-      <w:r>
-        <w:rPr>
-          <w:rFonts w:ascii="Arial" w:hAnsi="Arial" w:cs="Arial"/>
-          <w:b/>
-          <w:bCs/>
-          <w:sz w:val="18"/>
-          <w:szCs w:val="18"/>
-        </w:rPr>
-        <w:t>“</w:t>
-      </w:r>
-      <w:r>
-        <w:rPr>
-          <w:rFonts w:ascii="Arial" w:hAnsi="Arial" w:cs="Arial"/>
-          <w:b/>
-          <w:bCs/>
-          <w:sz w:val="18"/>
-          <w:szCs w:val="18"/>
-        </w:rPr>
-        <w:t>RESIDENCIAL LOS LAURELES DE CASTILLA</w:t>
+        <w:t>LAURELES DE CASTILLA</w:t>
       </w:r>
       <w:r>
         <w:rPr>
@@ -1452,7 +1240,27 @@
           <w:sz w:val="18"/>
           <w:szCs w:val="18"/>
         </w:rPr>
-        <w:t>«_PROMT»</w:t>
+        <w:t>«</w:t>
+      </w:r>
+      <w:r>
+        <w:rPr>
+          <w:rFonts w:ascii="Arial" w:hAnsi="Arial" w:cs="Arial"/>
+          <w:b/>
+          <w:bCs/>
+          <w:sz w:val="18"/>
+          <w:szCs w:val="18"/>
+        </w:rPr>
+        <w:t>COMPRADOR</w:t>
+      </w:r>
+      <w:r>
+        <w:rPr>
+          <w:rFonts w:ascii="Arial" w:hAnsi="Arial" w:cs="Arial"/>
+          <w:b/>
+          <w:bCs/>
+          <w:sz w:val="18"/>
+          <w:szCs w:val="18"/>
+        </w:rPr>
+        <w:t>»</w:t>
       </w:r>
       <w:r>
         <w:rPr>
@@ -1469,7 +1277,7 @@
           <w:sz w:val="18"/>
           <w:szCs w:val="18"/>
         </w:rPr>
-        <w:t>US$«_</w:t>
+        <w:t>DE US$«PRECIO» («PRECIO_TEXTO» Y «PRECIO_</w:t>
       </w:r>
       <w:proofErr w:type="gramStart"/>
       <w:r>
@@ -1479,7 +1287,7 @@
           <w:sz w:val="18"/>
           <w:szCs w:val="18"/>
         </w:rPr>
-        <w:t>PRECIO»(</w:t>
+        <w:t>DECIMAL»/</w:t>
       </w:r>
       <w:proofErr w:type="gramEnd"/>
       <w:r>
@@ -1489,32 +1297,7 @@
           <w:sz w:val="18"/>
           <w:szCs w:val="18"/>
         </w:rPr>
-        <w:t>«_PRECIO_TEXTO» Y «_PRECIO_DECIMAL»/100 DOLARES AMERICANOS</w:t>
-      </w:r>
-      <w:r>
-        <w:rPr>
-          <w:rFonts w:ascii="Arial" w:hAnsi="Arial" w:cs="Arial"/>
-          <w:b/>
-          <w:sz w:val="18"/>
-          <w:szCs w:val="18"/>
-        </w:rPr>
-        <w:t>)</w:t>
-      </w:r>
-      <w:r>
-        <w:rPr>
-          <w:rFonts w:ascii="Arial" w:hAnsi="Arial" w:cs="Arial"/>
-          <w:sz w:val="18"/>
-          <w:szCs w:val="18"/>
-        </w:rPr>
-        <w:t>.</w:t>
-      </w:r>
-      <w:r>
-        <w:rPr>
-          <w:rFonts w:ascii="Arial" w:hAnsi="Arial" w:cs="Arial"/>
-          <w:sz w:val="18"/>
-          <w:szCs w:val="18"/>
-        </w:rPr>
-        <w:t xml:space="preserve"> </w:t>
+        <w:t>100 DOLARES AMERICANOS).</w:t>
       </w:r>
     </w:p>
     <w:p>
@@ -1615,11 +1398,21 @@
           <w:sz w:val="18"/>
           <w:szCs w:val="18"/>
         </w:rPr>
-        <w:t>_SEP_SOLES»(«_SEP_SOLES_TEXTO» Y «_SEP_SOLES_DECIMAL»/100 SOLES</w:t>
-      </w:r>
-      <w:r>
-        <w:rPr>
-          <w:rFonts w:ascii="Arial" w:hAnsi="Arial" w:cs="Arial"/>
+        <w:t xml:space="preserve">SEP_SOLES» («SEP_SOLES_TEXTO» Y «SEP_SOLES_DECIMAL»/100 SOLES) QUE AL TIPO DE CAMBIO DE S/ «TIPO_CAMBIO» (CUATRO Y «TC_DECIMAL»/100 SOLES) EQUIVALE A </w:t>
+      </w:r>
+      <w:r>
+        <w:rPr>
+          <w:rFonts w:ascii="Arial" w:hAnsi="Arial" w:cs="Arial"/>
+          <w:b/>
+          <w:sz w:val="18"/>
+          <w:szCs w:val="18"/>
+        </w:rPr>
+        <w:t>US$«SEP» («SEP_TEXTO» Y «SEP_DECIMAL»/100 DOLARES AMERICANOS</w:t>
+      </w:r>
+      <w:r>
+        <w:rPr>
+          <w:rFonts w:ascii="Arial" w:hAnsi="Arial" w:cs="Arial"/>
+          <w:b/>
           <w:bCs/>
           <w:sz w:val="18"/>
           <w:szCs w:val="18"/>
@@ -1629,62 +1422,10 @@
       <w:r>
         <w:rPr>
           <w:rFonts w:ascii="Arial" w:hAnsi="Arial" w:cs="Arial"/>
-          <w:bCs/>
-          <w:sz w:val="18"/>
-          <w:szCs w:val="18"/>
-        </w:rPr>
-        <w:t xml:space="preserve"> QUE AL TIPO DE CAMBIO DE S/ 4.00 (CUATRO Y 00/100 SOLES) EQUIVALE A </w:t>
-      </w:r>
-      <w:r>
-        <w:rPr>
-          <w:rFonts w:ascii="Arial" w:hAnsi="Arial" w:cs="Arial"/>
-          <w:b/>
-          <w:sz w:val="18"/>
-          <w:szCs w:val="18"/>
-        </w:rPr>
-        <w:t>US$«_SEPARACION»(«_SEPARACION_TEXTO» Y «_SEPARACION_DECIMAL»/100 DOLARES AMERICANOS</w:t>
-      </w:r>
-      <w:r>
-        <w:rPr>
-          <w:rFonts w:ascii="Arial" w:hAnsi="Arial" w:cs="Arial"/>
-          <w:b/>
-          <w:bCs/>
-          <w:sz w:val="18"/>
-          <w:szCs w:val="18"/>
-        </w:rPr>
-        <w:t>)</w:t>
-      </w:r>
-      <w:r>
-        <w:rPr>
-          <w:rFonts w:ascii="Arial" w:hAnsi="Arial" w:cs="Arial"/>
-          <w:sz w:val="18"/>
-          <w:szCs w:val="18"/>
-        </w:rPr>
-        <w:t xml:space="preserve"> QUE HAN SIDO CANCELADOS</w:t>
-      </w:r>
-      <w:r>
-        <w:rPr>
-          <w:rFonts w:ascii="Arial" w:hAnsi="Arial" w:cs="Arial"/>
-          <w:sz w:val="18"/>
-          <w:szCs w:val="18"/>
-        </w:rPr>
-        <w:t xml:space="preserve"> A FAVOR DE LA VENDEDORA,</w:t>
-      </w:r>
-      <w:r>
-        <w:rPr>
-          <w:rFonts w:ascii="Arial" w:hAnsi="Arial" w:cs="Arial"/>
-          <w:sz w:val="18"/>
-          <w:szCs w:val="18"/>
-        </w:rPr>
-        <w:t xml:space="preserve"> CON </w:t>
-      </w:r>
-      <w:r>
-        <w:rPr>
-          <w:rFonts w:ascii="Arial" w:hAnsi="Arial" w:cs="Arial"/>
-          <w:sz w:val="18"/>
-          <w:szCs w:val="18"/>
-        </w:rPr>
-        <w:t xml:space="preserve">ANTERIORIDAD  A LA FIRMA DEL PRESENTE DOCUMENTO. </w:t>
+          <w:sz w:val="18"/>
+          <w:szCs w:val="18"/>
+        </w:rPr>
+        <w:t xml:space="preserve"> QUE HAN SIDO CANCELADOS A FAVOR DE LA VENDEDORA, CON ANTERIORIDAD  A LA FIRMA DEL PRESENTE DOCUMENTO. </w:t>
       </w:r>
     </w:p>
     <w:p>
@@ -1704,25 +1445,17 @@
           <w:sz w:val="18"/>
           <w:szCs w:val="18"/>
         </w:rPr>
-        <w:t xml:space="preserve">3.2.- </w:t>
-      </w:r>
-      <w:r>
-        <w:rPr>
-          <w:rFonts w:ascii="Arial" w:hAnsi="Arial" w:cs="Arial"/>
-          <w:sz w:val="18"/>
-          <w:szCs w:val="18"/>
-        </w:rPr>
-        <w:t xml:space="preserve">EL IMPORTE DE </w:t>
-      </w:r>
-      <w:r>
-        <w:rPr>
-          <w:rFonts w:ascii="Arial" w:hAnsi="Arial" w:cs="Arial"/>
-          <w:b/>
-          <w:bCs/>
-          <w:sz w:val="18"/>
-          <w:szCs w:val="18"/>
-        </w:rPr>
-        <w:t>US$«_</w:t>
+        <w:t xml:space="preserve">3.2.- EL IMPORTE DE </w:t>
+      </w:r>
+      <w:r>
+        <w:rPr>
+          <w:rFonts w:ascii="Arial" w:hAnsi="Arial" w:cs="Arial"/>
+          <w:b/>
+          <w:bCs/>
+          <w:sz w:val="18"/>
+          <w:szCs w:val="18"/>
+        </w:rPr>
+        <w:t>US$«PAGO» («PAGO_TEXTO» Y «PAGO_</w:t>
       </w:r>
       <w:proofErr w:type="gramStart"/>
       <w:r>
@@ -1733,7 +1466,7 @@
           <w:sz w:val="18"/>
           <w:szCs w:val="18"/>
         </w:rPr>
-        <w:t>PAGO»(</w:t>
+        <w:t>DECIMAL»/</w:t>
       </w:r>
       <w:proofErr w:type="gramEnd"/>
       <w:r>
@@ -1744,55 +1477,15 @@
           <w:sz w:val="18"/>
           <w:szCs w:val="18"/>
         </w:rPr>
-        <w:t>«_PAGO_TEXTO» Y «_PAGO_DECIMAL»/100 DOLARES AMERICANOS)</w:t>
-      </w:r>
-      <w:r>
-        <w:rPr>
-          <w:rFonts w:ascii="Arial" w:hAnsi="Arial" w:cs="Arial"/>
-          <w:sz w:val="18"/>
-          <w:szCs w:val="18"/>
-        </w:rPr>
-        <w:t xml:space="preserve">, HAN SIDO CANCELADOS </w:t>
-      </w:r>
-      <w:r>
-        <w:rPr>
-          <w:rFonts w:ascii="Arial" w:hAnsi="Arial" w:cs="Arial"/>
-          <w:sz w:val="18"/>
-          <w:szCs w:val="18"/>
-        </w:rPr>
-        <w:t xml:space="preserve">CON RECURSOS PROPIOS DE </w:t>
-      </w:r>
-      <w:r>
-        <w:rPr>
-          <w:rFonts w:ascii="Arial" w:hAnsi="Arial" w:cs="Arial"/>
-          <w:sz w:val="18"/>
-          <w:szCs w:val="18"/>
-        </w:rPr>
-        <w:t xml:space="preserve">«_PROMT» </w:t>
-      </w:r>
-      <w:r>
-        <w:rPr>
-          <w:rFonts w:ascii="Arial" w:hAnsi="Arial" w:cs="Arial"/>
-          <w:sz w:val="18"/>
-          <w:szCs w:val="18"/>
-        </w:rPr>
-        <w:t xml:space="preserve">EN EL CUAL SE INCLUYE LA SUMA ENTREGADA POR </w:t>
-      </w:r>
-      <w:r>
-        <w:rPr>
-          <w:rFonts w:ascii="Arial" w:hAnsi="Arial" w:cs="Arial"/>
-          <w:sz w:val="18"/>
-          <w:szCs w:val="18"/>
-        </w:rPr>
-        <w:t>«_PROMT»</w:t>
-      </w:r>
-      <w:r>
-        <w:rPr>
-          <w:rFonts w:ascii="Arial" w:hAnsi="Arial" w:cs="Arial"/>
-          <w:sz w:val="18"/>
-          <w:szCs w:val="18"/>
-        </w:rPr>
-        <w:t xml:space="preserve"> A TITULO DE ARRAS AL MOMENTO DE LA CELEBRACION DEL CONTRATO PRIVADO DE PROMESA DE VENTA, DESCRITO EN LA CLAUSULA SEGUNDA, Y QUE LAS PARTES ACUERDAN QUE SEAN IMPUTADAS COMO PAGO DEL PRECIO DE VENTA. </w:t>
+        <w:t>100 DOLARES AMERICANOS)</w:t>
+      </w:r>
+      <w:r>
+        <w:rPr>
+          <w:rFonts w:ascii="Arial" w:hAnsi="Arial" w:cs="Arial"/>
+          <w:sz w:val="18"/>
+          <w:szCs w:val="18"/>
+        </w:rPr>
+        <w:t xml:space="preserve">, HAN SIDO CANCELADOS CON RECURSOS PROPIOS DE «COMPRADOR» EN EL CUAL SE INCLUYE LA SUMA ENTREGADA POR «COMPRADOR» A TITULO DE ARRAS AL MOMENTO DE LA CELEBRACION DEL CONTRATO PRIVADO DE PROMESA DE VENTA, DESCRITO EN LA CLAUSULA SEGUNDA, Y QUE LAS PARTES ACUERDAN QUE SEAN IMPUTADAS COMO PAGO DEL PRECIO DE VENTA. </w:t>
       </w:r>
     </w:p>
     <w:p>
@@ -1812,16 +1505,16 @@
           <w:sz w:val="18"/>
           <w:szCs w:val="18"/>
         </w:rPr>
-        <w:t xml:space="preserve">3.2- EL SALDO POR LA SUMA DE </w:t>
-      </w:r>
-      <w:r>
-        <w:rPr>
-          <w:rFonts w:ascii="Arial" w:hAnsi="Arial" w:cs="Arial"/>
-          <w:b/>
-          <w:sz w:val="18"/>
-          <w:szCs w:val="18"/>
-        </w:rPr>
-        <w:t>US$«_</w:t>
+        <w:t xml:space="preserve">3.3- EL SALDO POR LA SUMA DE </w:t>
+      </w:r>
+      <w:r>
+        <w:rPr>
+          <w:rFonts w:ascii="Arial" w:hAnsi="Arial" w:cs="Arial"/>
+          <w:b/>
+          <w:sz w:val="18"/>
+          <w:szCs w:val="18"/>
+        </w:rPr>
+        <w:t>US$«SALDO» («SALDO_TEXTO» Y «SALDO_</w:t>
       </w:r>
       <w:proofErr w:type="gramStart"/>
       <w:r>
@@ -1831,7 +1524,7 @@
           <w:sz w:val="18"/>
           <w:szCs w:val="18"/>
         </w:rPr>
-        <w:t>SALDO»(</w:t>
+        <w:t>DECIMAL»/</w:t>
       </w:r>
       <w:proofErr w:type="gramEnd"/>
       <w:r>
@@ -1841,104 +1534,15 @@
           <w:sz w:val="18"/>
           <w:szCs w:val="18"/>
         </w:rPr>
-        <w:t>«_SALDO_TEXTO» Y «_SALDO_DECIMAL»/100 DOLARES AMERICANOS</w:t>
-      </w:r>
-      <w:r>
-        <w:rPr>
-          <w:rFonts w:ascii="Arial" w:hAnsi="Arial" w:cs="Arial"/>
-          <w:b/>
-          <w:sz w:val="18"/>
-          <w:szCs w:val="18"/>
-        </w:rPr>
-        <w:t>)</w:t>
-      </w:r>
-      <w:r>
-        <w:rPr>
-          <w:rFonts w:ascii="Arial" w:hAnsi="Arial" w:cs="Arial"/>
-          <w:sz w:val="18"/>
-          <w:szCs w:val="18"/>
-        </w:rPr>
-        <w:t xml:space="preserve"> </w:t>
-      </w:r>
-      <w:r>
-        <w:rPr>
-          <w:rFonts w:ascii="Arial" w:hAnsi="Arial" w:cs="Arial"/>
-          <w:sz w:val="18"/>
-          <w:szCs w:val="18"/>
-        </w:rPr>
-        <w:t xml:space="preserve">SERAN CANCELADOS MEDIANTE DEPÓSITO BANCARIO, TRANSFERENCIA INTERBANCARIA, O CHEQUE DE GERENCIA, A FAVOR DE </w:t>
-      </w:r>
-      <w:r>
-        <w:rPr>
-          <w:rFonts w:ascii="Arial" w:hAnsi="Arial" w:cs="Arial"/>
-          <w:sz w:val="18"/>
-          <w:szCs w:val="18"/>
-        </w:rPr>
-        <w:t>LA VENDEDORA</w:t>
-      </w:r>
-      <w:r>
-        <w:rPr>
-          <w:rFonts w:ascii="Arial" w:hAnsi="Arial" w:cs="Arial"/>
-          <w:sz w:val="18"/>
-          <w:szCs w:val="18"/>
-        </w:rPr>
-        <w:t>,</w:t>
-      </w:r>
-      <w:r>
-        <w:rPr>
-          <w:rFonts w:ascii="Arial" w:hAnsi="Arial" w:cs="Arial"/>
-          <w:sz w:val="18"/>
-          <w:szCs w:val="18"/>
-        </w:rPr>
-        <w:t xml:space="preserve"> </w:t>
-      </w:r>
-      <w:r>
-        <w:rPr>
-          <w:rFonts w:ascii="Arial" w:hAnsi="Arial" w:cs="Arial"/>
-          <w:sz w:val="18"/>
-          <w:szCs w:val="18"/>
-        </w:rPr>
-        <w:t>EN EL LAPSO DE «PLAZO» («PLAZO_TEXTO») «DIA/MES»</w:t>
-      </w:r>
-      <w:r>
-        <w:rPr>
-          <w:rFonts w:ascii="Arial" w:hAnsi="Arial" w:cs="Arial"/>
-          <w:sz w:val="18"/>
-          <w:szCs w:val="18"/>
-        </w:rPr>
-        <w:t xml:space="preserve">, SIENDO LA SOLA FIRMA POR PARTE DE LA VENDEDORA EN </w:t>
-      </w:r>
-      <w:r>
-        <w:rPr>
-          <w:rFonts w:ascii="Arial" w:hAnsi="Arial" w:cs="Arial"/>
-          <w:sz w:val="18"/>
-          <w:szCs w:val="18"/>
-        </w:rPr>
-        <w:t>LA ESCRITURA PUBLICA QUE DE ORIGEN LA PRESENTE MINUTA DE COMPRAVENTA</w:t>
-      </w:r>
-      <w:r>
-        <w:rPr>
-          <w:rFonts w:ascii="Arial" w:hAnsi="Arial" w:cs="Arial"/>
-          <w:sz w:val="18"/>
-          <w:szCs w:val="18"/>
-        </w:rPr>
-        <w:t xml:space="preserve"> CONSTANCIA SUFICIENTE DE SU CANCELACION TOTAL DEL PRECIO DE VENTA</w:t>
-      </w:r>
-      <w:r>
-        <w:rPr>
-          <w:rFonts w:ascii="Arial" w:hAnsi="Arial" w:cs="Arial"/>
-          <w:sz w:val="18"/>
-          <w:szCs w:val="18"/>
-        </w:rPr>
-        <w:t>.</w:t>
-      </w:r>
-      <w:r>
-        <w:rPr>
-          <w:rFonts w:ascii="Arial" w:hAnsi="Arial" w:cs="Arial"/>
-          <w:sz w:val="18"/>
-          <w:szCs w:val="18"/>
-        </w:rPr>
-        <w:t xml:space="preserve"> </w:t>
+        <w:t>100 DOLARES AMERICANOS)</w:t>
+      </w:r>
+      <w:r>
+        <w:rPr>
+          <w:rFonts w:ascii="Arial" w:hAnsi="Arial" w:cs="Arial"/>
+          <w:sz w:val="18"/>
+          <w:szCs w:val="18"/>
+        </w:rPr>
+        <w:t xml:space="preserve"> SERAN CANCELADOS MEDIANTE DEPÓSITO BANCARIO, TRANSFERENCIA INTERBANCARIA, O CHEQUE DE GERENCIA, A FAVOR DE LA VENDEDORA, EN EL LAPSO DE «PLAZO» («PLAZO_TEXTO») MESES, SIENDO LA SOLA FIRMA POR PARTE DE LA VENDEDORA EN LA ESCRITURA PUBLICA QUE DE ORIGEN LA PRESENTE MINUTA DE COMPRAVENTA CONSTANCIA SUFICIENTE DE SU CANCELACION TOTAL DEL PRECIO DE VENTA. </w:t>
       </w:r>
     </w:p>
     <w:p>
@@ -2071,7 +1675,25 @@
           <w:sz w:val="18"/>
           <w:szCs w:val="18"/>
         </w:rPr>
-        <w:t>«_PROMT»</w:t>
+        <w:t>«</w:t>
+      </w:r>
+      <w:r>
+        <w:rPr>
+          <w:rFonts w:ascii="Arial" w:hAnsi="Arial" w:cs="Arial"/>
+          <w:b/>
+          <w:sz w:val="18"/>
+          <w:szCs w:val="18"/>
+        </w:rPr>
+        <w:t>COMPRADOR</w:t>
+      </w:r>
+      <w:r>
+        <w:rPr>
+          <w:rFonts w:ascii="Arial" w:hAnsi="Arial" w:cs="Arial"/>
+          <w:b/>
+          <w:sz w:val="18"/>
+          <w:szCs w:val="18"/>
+        </w:rPr>
+        <w:t>»</w:t>
       </w:r>
       <w:r>
         <w:rPr>
@@ -2108,7 +1730,25 @@
           <w:sz w:val="18"/>
           <w:szCs w:val="18"/>
         </w:rPr>
-        <w:t>«_PROMT»</w:t>
+        <w:t>«</w:t>
+      </w:r>
+      <w:r>
+        <w:rPr>
+          <w:rFonts w:ascii="Arial" w:hAnsi="Arial" w:cs="Arial"/>
+          <w:bCs/>
+          <w:sz w:val="18"/>
+          <w:szCs w:val="18"/>
+        </w:rPr>
+        <w:t>COMPRADOR</w:t>
+      </w:r>
+      <w:r>
+        <w:rPr>
+          <w:rFonts w:ascii="Arial" w:hAnsi="Arial" w:cs="Arial"/>
+          <w:bCs/>
+          <w:sz w:val="18"/>
+          <w:szCs w:val="18"/>
+        </w:rPr>
+        <w:t>»</w:t>
       </w:r>
       <w:r>
         <w:rPr>
@@ -2178,7 +1818,25 @@
           <w:sz w:val="18"/>
           <w:szCs w:val="18"/>
         </w:rPr>
-        <w:t>«_PROMT»</w:t>
+        <w:t>«</w:t>
+      </w:r>
+      <w:r>
+        <w:rPr>
+          <w:rFonts w:ascii="Arial" w:hAnsi="Arial" w:cs="Arial"/>
+          <w:b/>
+          <w:sz w:val="18"/>
+          <w:szCs w:val="18"/>
+        </w:rPr>
+        <w:t>COMPRADOR</w:t>
+      </w:r>
+      <w:r>
+        <w:rPr>
+          <w:rFonts w:ascii="Arial" w:hAnsi="Arial" w:cs="Arial"/>
+          <w:b/>
+          <w:sz w:val="18"/>
+          <w:szCs w:val="18"/>
+        </w:rPr>
+        <w:t>»</w:t>
       </w:r>
       <w:r>
         <w:rPr>
@@ -2336,7 +1994,7 @@
           <w:sz w:val="18"/>
           <w:szCs w:val="18"/>
         </w:rPr>
-        <w:t>, ASI COMO LA INSTALACION DE LOS SERVICIOS BASICOS COMO ELECTRIFICACIÓN, AGUA Y ALCANTARILLADO EN CADA UNIDAD INDEPENDIZADA</w:t>
+        <w:t>, ASI COMO LA INSTALACION DE LOS SERVICIOS BASICOS COMO ELECTRIFICACIÓN, AGUA Y ALCANTARILLADO</w:t>
       </w:r>
       <w:r>
         <w:rPr>
@@ -2560,7 +2218,6 @@
           <w:sz w:val="18"/>
           <w:szCs w:val="18"/>
         </w:rPr>
-        <w:lastRenderedPageBreak/>
         <w:t>SEXTA</w:t>
       </w:r>
       <w:r>
@@ -2718,6 +2375,7 @@
           <w:sz w:val="18"/>
           <w:szCs w:val="18"/>
         </w:rPr>
+        <w:lastRenderedPageBreak/>
         <w:t xml:space="preserve">- </w:t>
       </w:r>
       <w:r>
@@ -2760,7 +2418,23 @@
           <w:sz w:val="18"/>
           <w:szCs w:val="18"/>
         </w:rPr>
-        <w:t>«_PROMT»</w:t>
+        <w:t>«</w:t>
+      </w:r>
+      <w:r>
+        <w:rPr>
+          <w:rFonts w:ascii="Arial" w:hAnsi="Arial" w:cs="Arial"/>
+          <w:sz w:val="18"/>
+          <w:szCs w:val="18"/>
+        </w:rPr>
+        <w:t>COMPRADOR</w:t>
+      </w:r>
+      <w:r>
+        <w:rPr>
+          <w:rFonts w:ascii="Arial" w:hAnsi="Arial" w:cs="Arial"/>
+          <w:sz w:val="18"/>
+          <w:szCs w:val="18"/>
+        </w:rPr>
+        <w:t>»</w:t>
       </w:r>
       <w:r>
         <w:rPr>
@@ -2802,7 +2476,17 @@
           <w:sz w:val="18"/>
           <w:szCs w:val="18"/>
         </w:rPr>
-        <w:t xml:space="preserve">20 (VEINTE) </w:t>
+        <w:t>«ENTREGA» («ENTREGA_TEXTO»)</w:t>
+      </w:r>
+      <w:r>
+        <w:rPr>
+          <w:rFonts w:ascii="Arial" w:hAnsi="Arial" w:cs="Arial"/>
+          <w:b/>
+          <w:bCs/>
+          <w:sz w:val="18"/>
+          <w:szCs w:val="18"/>
+        </w:rPr>
+        <w:t xml:space="preserve"> </w:t>
       </w:r>
       <w:r>
         <w:rPr>
@@ -2936,7 +2620,27 @@
           <w:sz w:val="18"/>
           <w:szCs w:val="18"/>
         </w:rPr>
-        <w:t>«_PROMT»</w:t>
+        <w:t>«</w:t>
+      </w:r>
+      <w:r>
+        <w:rPr>
+          <w:rFonts w:ascii="Arial" w:hAnsi="Arial" w:cs="Arial"/>
+          <w:b/>
+          <w:bCs/>
+          <w:sz w:val="18"/>
+          <w:szCs w:val="18"/>
+        </w:rPr>
+        <w:t>COMPRADOR</w:t>
+      </w:r>
+      <w:r>
+        <w:rPr>
+          <w:rFonts w:ascii="Arial" w:hAnsi="Arial" w:cs="Arial"/>
+          <w:b/>
+          <w:bCs/>
+          <w:sz w:val="18"/>
+          <w:szCs w:val="18"/>
+        </w:rPr>
+        <w:t>»</w:t>
       </w:r>
       <w:r>
         <w:rPr>
@@ -3324,7 +3028,23 @@
           <w:sz w:val="18"/>
           <w:szCs w:val="18"/>
         </w:rPr>
-        <w:t>«_PROMT»</w:t>
+        <w:t>«</w:t>
+      </w:r>
+      <w:r>
+        <w:rPr>
+          <w:rFonts w:ascii="Arial" w:hAnsi="Arial" w:cs="Arial"/>
+          <w:sz w:val="18"/>
+          <w:szCs w:val="18"/>
+        </w:rPr>
+        <w:t>COMPRADOR</w:t>
+      </w:r>
+      <w:r>
+        <w:rPr>
+          <w:rFonts w:ascii="Arial" w:hAnsi="Arial" w:cs="Arial"/>
+          <w:sz w:val="18"/>
+          <w:szCs w:val="18"/>
+        </w:rPr>
+        <w:t>»</w:t>
       </w:r>
       <w:r>
         <w:rPr>
@@ -3376,7 +3096,23 @@
           <w:sz w:val="18"/>
           <w:szCs w:val="18"/>
         </w:rPr>
-        <w:t>«_PROMT»</w:t>
+        <w:t>«</w:t>
+      </w:r>
+      <w:r>
+        <w:rPr>
+          <w:rFonts w:ascii="Arial" w:hAnsi="Arial" w:cs="Arial"/>
+          <w:sz w:val="18"/>
+          <w:szCs w:val="18"/>
+        </w:rPr>
+        <w:t>COMPRADOR</w:t>
+      </w:r>
+      <w:r>
+        <w:rPr>
+          <w:rFonts w:ascii="Arial" w:hAnsi="Arial" w:cs="Arial"/>
+          <w:sz w:val="18"/>
+          <w:szCs w:val="18"/>
+        </w:rPr>
+        <w:t>»</w:t>
       </w:r>
       <w:r>
         <w:rPr>
@@ -3590,7 +3326,23 @@
           <w:sz w:val="18"/>
           <w:szCs w:val="18"/>
         </w:rPr>
-        <w:t>«_PROMT»</w:t>
+        <w:t>«</w:t>
+      </w:r>
+      <w:r>
+        <w:rPr>
+          <w:rFonts w:ascii="Arial" w:hAnsi="Arial" w:cs="Arial"/>
+          <w:sz w:val="18"/>
+          <w:szCs w:val="18"/>
+        </w:rPr>
+        <w:t>COMPRADOR</w:t>
+      </w:r>
+      <w:r>
+        <w:rPr>
+          <w:rFonts w:ascii="Arial" w:hAnsi="Arial" w:cs="Arial"/>
+          <w:sz w:val="18"/>
+          <w:szCs w:val="18"/>
+        </w:rPr>
+        <w:t>»</w:t>
       </w:r>
       <w:r>
         <w:rPr>
@@ -3621,6 +3373,7 @@
           <w:sz w:val="18"/>
           <w:szCs w:val="18"/>
         </w:rPr>
+        <w:lastRenderedPageBreak/>
         <w:t>DECIM</w:t>
       </w:r>
       <w:r>
@@ -3691,7 +3444,6 @@
           <w:sz w:val="18"/>
           <w:szCs w:val="18"/>
         </w:rPr>
-        <w:lastRenderedPageBreak/>
         <w:t xml:space="preserve">PARA EFECTOS DE CUALQUIER CONTROVERSIA QUE SE GENERE CON MOTIVO DE LA CELEBRACIÓN Y EJECUCIÓN DEL PRESENTE CONTRATO, LAS PARTES SE SOMETEN A LA COMPETENCIA TERRITORIAL DE LOS JUECES Y TRIBUNALES DE LA CIUDAD DE TRUJILLO, SEÑALANDO COMO SUS DOMICILIOS LOS CONSIGNADOS EN LAS ESPECIFICACIONES GENERALES DEL PRESENTE DOCUMENTO, EN DONDE SE LES HARÁ LLEGAR TODAS LAS COMUNICACIONES RELACIONADAS CON ESTE CONTRATO. EL CAMBIO DE DOMICILIO DE CUALQUIERA DE LAS PARTES SURTIRÁ EFECTO RESPECTO DE LA OTRA DESDE LA FECHA EN QUE SE LE COMUNIQUE NOTARIALMENTE DICHO CAMBIO. </w:t>
       </w:r>
     </w:p>
@@ -3770,31 +3522,7 @@
           <w:sz w:val="18"/>
           <w:szCs w:val="18"/>
         </w:rPr>
-        <w:t>TRUJILLO,</w:t>
-      </w:r>
-      <w:r>
-        <w:rPr>
-          <w:rFonts w:ascii="Arial" w:hAnsi="Arial" w:cs="Arial"/>
-          <w:sz w:val="18"/>
-          <w:szCs w:val="18"/>
-        </w:rPr>
-        <w:t xml:space="preserve"> </w:t>
-      </w:r>
-      <w:r>
-        <w:rPr>
-          <w:rFonts w:ascii="Arial" w:hAnsi="Arial" w:cs="Arial"/>
-          <w:sz w:val="18"/>
-          <w:szCs w:val="18"/>
-        </w:rPr>
-        <w:t>«FECHA_TEXTO»</w:t>
-      </w:r>
-      <w:r>
-        <w:rPr>
-          <w:rFonts w:ascii="Arial" w:hAnsi="Arial" w:cs="Arial"/>
-          <w:sz w:val="18"/>
-          <w:szCs w:val="18"/>
-        </w:rPr>
-        <w:t xml:space="preserve">. </w:t>
+        <w:t>TRUJILLO, «FECHA».</w:t>
       </w:r>
     </w:p>
     <w:p>
@@ -3855,7 +3583,6 @@
         <w:autoSpaceDN w:val="0"/>
         <w:adjustRightInd w:val="0"/>
         <w:spacing w:line="324" w:lineRule="auto"/>
-        <w:ind w:left="709"/>
         <w:jc w:val="both"/>
         <w:rPr>
           <w:rFonts w:ascii="Arial" w:hAnsi="Arial" w:cs="Arial"/>
@@ -3915,7 +3642,136 @@
           <w:sz w:val="18"/>
           <w:szCs w:val="18"/>
         </w:rPr>
-      </w:pPr>
+        <w:sectPr>
+          <w:pgSz w:w="11906" w:h="16838"/>
+          <w:pgMar w:top="2835" w:right="737" w:bottom="567" w:left="2381" w:header="709" w:footer="709" w:gutter="0"/>
+          <w:cols w:space="708"/>
+          <w:docGrid w:linePitch="360"/>
+        </w:sectPr>
+      </w:pPr>
+    </w:p>
+    <w:p>
+      <w:pPr>
+        <w:widowControl w:val="0"/>
+        <w:autoSpaceDE w:val="0"/>
+        <w:autoSpaceDN w:val="0"/>
+        <w:adjustRightInd w:val="0"/>
+        <w:spacing w:line="324" w:lineRule="auto"/>
+        <w:jc w:val="center"/>
+        <w:rPr>
+          <w:rFonts w:ascii="Arial" w:hAnsi="Arial" w:cs="Arial"/>
+          <w:b/>
+          <w:bCs/>
+          <w:sz w:val="18"/>
+          <w:szCs w:val="18"/>
+        </w:rPr>
+      </w:pPr>
+      <w:r>
+        <w:rPr>
+          <w:rFonts w:ascii="Arial" w:hAnsi="Arial" w:cs="Arial"/>
+          <w:b/>
+          <w:bCs/>
+          <w:sz w:val="18"/>
+          <w:szCs w:val="18"/>
+        </w:rPr>
+        <w:t>________________________________</w:t>
+      </w:r>
+      <w:r>
+        <w:rPr>
+          <w:rFonts w:ascii="Arial" w:hAnsi="Arial" w:cs="Arial"/>
+          <w:b/>
+          <w:bCs/>
+          <w:sz w:val="18"/>
+          <w:szCs w:val="18"/>
+        </w:rPr>
+        <w:t>______</w:t>
+      </w:r>
+    </w:p>
+    <w:p>
+      <w:pPr>
+        <w:widowControl w:val="0"/>
+        <w:autoSpaceDE w:val="0"/>
+        <w:autoSpaceDN w:val="0"/>
+        <w:adjustRightInd w:val="0"/>
+        <w:spacing w:line="324" w:lineRule="auto"/>
+        <w:jc w:val="center"/>
+        <w:rPr>
+          <w:rFonts w:ascii="Arial" w:eastAsia="Arial Unicode MS" w:hAnsi="Arial" w:cs="Arial"/>
+          <w:b/>
+          <w:bCs/>
+          <w:sz w:val="18"/>
+          <w:szCs w:val="18"/>
+          <w:lang w:val="pt-BR"/>
+        </w:rPr>
+      </w:pPr>
+      <w:r>
+        <w:rPr>
+          <w:rFonts w:ascii="Arial" w:eastAsia="Arial Unicode MS" w:hAnsi="Arial" w:cs="Arial"/>
+          <w:b/>
+          <w:bCs/>
+          <w:sz w:val="18"/>
+          <w:szCs w:val="18"/>
+          <w:lang w:val="pt-BR"/>
+        </w:rPr>
+        <w:t>ILICH ALEXANDER MERCEDES VALVERDE</w:t>
+      </w:r>
+    </w:p>
+    <w:p>
+      <w:pPr>
+        <w:widowControl w:val="0"/>
+        <w:autoSpaceDE w:val="0"/>
+        <w:autoSpaceDN w:val="0"/>
+        <w:adjustRightInd w:val="0"/>
+        <w:spacing w:line="324" w:lineRule="auto"/>
+        <w:jc w:val="center"/>
+        <w:rPr>
+          <w:rFonts w:ascii="Arial" w:hAnsi="Arial" w:cs="Arial"/>
+          <w:b/>
+          <w:bCs/>
+          <w:sz w:val="18"/>
+          <w:szCs w:val="18"/>
+          <w:lang w:val="es-ES_tradnl"/>
+        </w:rPr>
+      </w:pPr>
+      <w:r>
+        <w:rPr>
+          <w:rFonts w:ascii="Arial" w:hAnsi="Arial" w:cs="Arial"/>
+          <w:b/>
+          <w:bCs/>
+          <w:sz w:val="18"/>
+          <w:szCs w:val="18"/>
+        </w:rPr>
+        <w:t>______________________________________</w:t>
+      </w:r>
+    </w:p>
+    <w:p>
+      <w:pPr>
+        <w:widowControl w:val="0"/>
+        <w:autoSpaceDE w:val="0"/>
+        <w:autoSpaceDN w:val="0"/>
+        <w:adjustRightInd w:val="0"/>
+        <w:spacing w:line="324" w:lineRule="auto"/>
+        <w:jc w:val="center"/>
+        <w:rPr>
+          <w:rFonts w:ascii="Arial" w:eastAsia="Arial Unicode MS" w:hAnsi="Arial" w:cs="Arial"/>
+          <w:b/>
+          <w:bCs/>
+          <w:sz w:val="18"/>
+          <w:szCs w:val="18"/>
+          <w:lang w:val="pt-BR"/>
+        </w:rPr>
+      </w:pPr>
+      <w:r>
+        <w:rPr>
+          <w:rFonts w:ascii="Arial" w:hAnsi="Arial" w:cs="Arial"/>
+          <w:b/>
+          <w:bCs/>
+          <w:sz w:val="18"/>
+          <w:szCs w:val="18"/>
+          <w:lang w:val="es-ES_tradnl"/>
+        </w:rPr>
+        <w:t>«TITULAR»</w:t>
+      </w:r>
     </w:p>
     <w:p>
       <w:pPr>
@@ -3926,83 +3782,21 @@
         <w:spacing w:line="324" w:lineRule="auto"/>
         <w:jc w:val="both"/>
         <w:rPr>
-          <w:rFonts w:ascii="Arial" w:hAnsi="Arial" w:cs="Arial"/>
-          <w:b/>
-          <w:bCs/>
-          <w:sz w:val="18"/>
-          <w:szCs w:val="18"/>
-        </w:rPr>
-      </w:pPr>
-      <w:r>
-        <w:rPr>
-          <w:rFonts w:ascii="Arial" w:hAnsi="Arial" w:cs="Arial"/>
-          <w:b/>
-          <w:bCs/>
-          <w:sz w:val="18"/>
-          <w:szCs w:val="18"/>
-        </w:rPr>
-        <w:t>________________________________</w:t>
-      </w:r>
-      <w:r>
-        <w:rPr>
-          <w:rFonts w:ascii="Arial" w:hAnsi="Arial" w:cs="Arial"/>
-          <w:b/>
-          <w:bCs/>
-          <w:sz w:val="18"/>
-          <w:szCs w:val="18"/>
-        </w:rPr>
-        <w:t>______</w:t>
-      </w:r>
-      <w:r>
-        <w:rPr>
-          <w:rFonts w:ascii="Arial" w:hAnsi="Arial" w:cs="Arial"/>
-          <w:b/>
-          <w:bCs/>
-          <w:sz w:val="18"/>
-          <w:szCs w:val="18"/>
-        </w:rPr>
-        <w:t xml:space="preserve">                             </w:t>
-      </w:r>
-      <w:r>
-        <w:rPr>
-          <w:rFonts w:ascii="Arial" w:hAnsi="Arial" w:cs="Arial"/>
-          <w:b/>
-          <w:bCs/>
-          <w:sz w:val="18"/>
-          <w:szCs w:val="18"/>
-        </w:rPr>
-        <w:t xml:space="preserve">      </w:t>
-      </w:r>
-      <w:r>
-        <w:rPr>
-          <w:rFonts w:ascii="Arial" w:hAnsi="Arial" w:cs="Arial"/>
-          <w:b/>
-          <w:bCs/>
-          <w:sz w:val="18"/>
-          <w:szCs w:val="18"/>
-        </w:rPr>
-        <w:t>_</w:t>
-      </w:r>
-      <w:r>
-        <w:rPr>
-          <w:rFonts w:ascii="Arial" w:hAnsi="Arial" w:cs="Arial"/>
-          <w:b/>
-          <w:bCs/>
-          <w:sz w:val="18"/>
-          <w:szCs w:val="18"/>
-        </w:rPr>
-        <w:t>_______</w:t>
-      </w:r>
-      <w:r>
-        <w:rPr>
-          <w:rFonts w:ascii="Arial" w:hAnsi="Arial" w:cs="Arial"/>
-          <w:b/>
-          <w:bCs/>
-          <w:sz w:val="18"/>
-          <w:szCs w:val="18"/>
-        </w:rPr>
-        <w:t>________________________</w:t>
-      </w:r>
+          <w:rFonts w:ascii="Arial" w:eastAsia="Arial Unicode MS" w:hAnsi="Arial" w:cs="Arial"/>
+          <w:b/>
+          <w:bCs/>
+          <w:sz w:val="18"/>
+          <w:szCs w:val="18"/>
+          <w:lang w:val="pt-BR"/>
+        </w:rPr>
+        <w:sectPr>
+          <w:type w:val="continuous"/>
+          <w:pgSz w:w="11906" w:h="16838"/>
+          <w:pgMar w:top="2835" w:right="737" w:bottom="567" w:left="2381" w:header="709" w:footer="709" w:gutter="0"/>
+          <w:cols w:num="2" w:space="708"/>
+          <w:docGrid w:linePitch="360"/>
+        </w:sectPr>
+      </w:pPr>
     </w:p>
     <w:p>
       <w:pPr>
@@ -4021,61 +3815,6 @@
           <w:lang w:val="pt-BR"/>
         </w:rPr>
       </w:pPr>
-      <w:r>
-        <w:rPr>
-          <w:rFonts w:ascii="Arial" w:eastAsia="Arial Unicode MS" w:hAnsi="Arial" w:cs="Arial"/>
-          <w:b/>
-          <w:bCs/>
-          <w:sz w:val="18"/>
-          <w:szCs w:val="18"/>
-          <w:lang w:val="pt-BR"/>
-        </w:rPr>
-        <w:t>ILICH ALEXANDER MERCEDES VALVERDE</w:t>
-      </w:r>
-      <w:r>
-        <w:rPr>
-          <w:rFonts w:ascii="Arial" w:eastAsia="Arial Unicode MS" w:hAnsi="Arial" w:cs="Arial"/>
-          <w:b/>
-          <w:bCs/>
-          <w:sz w:val="18"/>
-          <w:szCs w:val="18"/>
-          <w:lang w:val="pt-BR"/>
-        </w:rPr>
-        <w:t xml:space="preserve">                    </w:t>
-      </w:r>
-      <w:r>
-        <w:rPr>
-          <w:rFonts w:ascii="Arial" w:eastAsia="Arial Unicode MS" w:hAnsi="Arial" w:cs="Arial"/>
-          <w:b/>
-          <w:bCs/>
-          <w:sz w:val="18"/>
-          <w:szCs w:val="18"/>
-          <w:lang w:val="pt-BR"/>
-        </w:rPr>
-        <w:t xml:space="preserve">        </w:t>
-      </w:r>
-      <w:r>
-        <w:rPr>
-          <w:rFonts w:ascii="Arial" w:eastAsia="Arial Unicode MS" w:hAnsi="Arial" w:cs="Arial"/>
-          <w:b/>
-          <w:bCs/>
-          <w:sz w:val="18"/>
-          <w:szCs w:val="18"/>
-          <w:lang w:val="pt-BR"/>
-        </w:rPr>
-        <w:t xml:space="preserve">         </w:t>
-      </w:r>
-      <w:r>
-        <w:rPr>
-          <w:rFonts w:ascii="Arial" w:hAnsi="Arial" w:cs="Arial"/>
-          <w:b/>
-          <w:bCs/>
-          <w:sz w:val="18"/>
-          <w:szCs w:val="18"/>
-          <w:lang w:val="es-ES_tradnl"/>
-        </w:rPr>
-        <w:t>«TITULAR»</w:t>
-      </w:r>
     </w:p>
     <w:p>
       <w:pPr>
@@ -4145,28 +3884,11 @@
           <w:bCs/>
           <w:sz w:val="18"/>
           <w:szCs w:val="18"/>
-          <w:lang w:val="pt-BR"/>
-        </w:rPr>
-      </w:pPr>
-    </w:p>
-    <w:p>
-      <w:pPr>
-        <w:widowControl w:val="0"/>
-        <w:autoSpaceDE w:val="0"/>
-        <w:autoSpaceDN w:val="0"/>
-        <w:adjustRightInd w:val="0"/>
-        <w:spacing w:line="324" w:lineRule="auto"/>
-        <w:jc w:val="both"/>
-        <w:rPr>
-          <w:rFonts w:ascii="Arial" w:eastAsia="Arial Unicode MS" w:hAnsi="Arial" w:cs="Arial"/>
-          <w:b/>
-          <w:bCs/>
-          <w:sz w:val="18"/>
-          <w:szCs w:val="18"/>
         </w:rPr>
       </w:pPr>
     </w:p>
     <w:sectPr>
+      <w:type w:val="continuous"/>
       <w:pgSz w:w="11906" w:h="16838"/>
       <w:pgMar w:top="2835" w:right="737" w:bottom="567" w:left="2381" w:header="709" w:footer="709" w:gutter="0"/>
       <w:cols w:space="708"/>
@@ -5481,7 +5203,7 @@
     <w:lsdException w:name="E-mail Signature" w:semiHidden="1" w:unhideWhenUsed="1"/>
     <w:lsdException w:name="HTML Top of Form" w:semiHidden="1" w:unhideWhenUsed="1"/>
     <w:lsdException w:name="HTML Bottom of Form" w:semiHidden="1" w:unhideWhenUsed="1"/>
-    <w:lsdException w:name="Normal (Web)" w:semiHidden="1" w:uiPriority="0" w:unhideWhenUsed="1"/>
+    <w:lsdException w:name="Normal (Web)" w:semiHidden="1" w:unhideWhenUsed="1"/>
     <w:lsdException w:name="HTML Acronym" w:semiHidden="1" w:unhideWhenUsed="1"/>
     <w:lsdException w:name="HTML Address" w:semiHidden="1" w:unhideWhenUsed="1"/>
     <w:lsdException w:name="HTML Cite" w:semiHidden="1" w:unhideWhenUsed="1"/>
@@ -6054,6 +5776,7 @@
   <w:style w:type="paragraph" w:styleId="NormalWeb">
     <w:name w:val="Normal (Web)"/>
     <w:basedOn w:val="Normal"/>
+    <w:uiPriority w:val="99"/>
     <w:rsid w:val="000561C5"/>
     <w:pPr>
       <w:spacing w:before="100" w:beforeAutospacing="1" w:after="100" w:afterAutospacing="1"/>

</xml_diff>

<commit_message>
feat: agregar marcador MODALIDAD_ENTREGA en templates
</commit_message>
<xml_diff>
--- a/app/templates/laureles/AMARILLO.docx
+++ b/app/templates/laureles/AMARILLO.docx
@@ -249,15 +249,37 @@
           <w:szCs w:val="18"/>
           <w:lang w:val="es-ES_tradnl"/>
         </w:rPr>
-        <w:t>20609784271, CON DOMICILIO EN EL JR. AYACUCHO N° 513, INT. 205 CENTRO HISTÓRICO, DISTRITO Y PROVINCIA DE TRUJILLO, DEPARTAMENTO DE LA LIBERTAD</w:t>
-      </w:r>
-      <w:r>
-        <w:rPr>
-          <w:rFonts w:ascii="Arial" w:hAnsi="Arial" w:cs="Arial"/>
+        <w:t xml:space="preserve">20609784271, CON DOMICILIO EN EL JR. AYACUCHO </w:t>
+      </w:r>
+      <w:proofErr w:type="spellStart"/>
+      <w:r>
+        <w:rPr>
+          <w:rFonts w:ascii="Arial" w:hAnsi="Arial" w:cs="Arial"/>
+          <w:bCs/>
           <w:sz w:val="18"/>
           <w:szCs w:val="18"/>
           <w:lang w:val="es-ES_tradnl"/>
         </w:rPr>
+        <w:t>N°</w:t>
+      </w:r>
+      <w:proofErr w:type="spellEnd"/>
+      <w:r>
+        <w:rPr>
+          <w:rFonts w:ascii="Arial" w:hAnsi="Arial" w:cs="Arial"/>
+          <w:bCs/>
+          <w:sz w:val="18"/>
+          <w:szCs w:val="18"/>
+          <w:lang w:val="es-ES_tradnl"/>
+        </w:rPr>
+        <w:t xml:space="preserve"> 513, INT. 205 CENTRO HISTÓRICO, DISTRITO Y PROVINCIA DE TRUJILLO, DEPARTAMENTO DE LA LIBERTAD</w:t>
+      </w:r>
+      <w:r>
+        <w:rPr>
+          <w:rFonts w:ascii="Arial" w:hAnsi="Arial" w:cs="Arial"/>
+          <w:sz w:val="18"/>
+          <w:szCs w:val="18"/>
+          <w:lang w:val="es-ES_tradnl"/>
+        </w:rPr>
         <w:t>,</w:t>
       </w:r>
       <w:r>
@@ -278,7 +300,27 @@
           <w:szCs w:val="18"/>
           <w:lang w:val="es-ES_tradnl"/>
         </w:rPr>
-        <w:t>SEGUN FACULTADES INSCRITAS EN LA PARTIDA REGISTRAL 11486486 DEL REGISTRO DE PERSONAS JURIDICAS DE LA ZONA REGISTRAL N° V - SEDE TRUJILLO, OFICINA REGISTRAL DE TRUJILLO</w:t>
+        <w:t xml:space="preserve">SEGUN FACULTADES INSCRITAS EN LA PARTIDA REGISTRAL 11486486 DEL REGISTRO DE PERSONAS JURIDICAS DE LA ZONA REGISTRAL </w:t>
+      </w:r>
+      <w:proofErr w:type="spellStart"/>
+      <w:r>
+        <w:rPr>
+          <w:rFonts w:ascii="Arial" w:hAnsi="Arial" w:cs="Arial"/>
+          <w:sz w:val="18"/>
+          <w:szCs w:val="18"/>
+          <w:lang w:val="es-ES_tradnl"/>
+        </w:rPr>
+        <w:t>N°</w:t>
+      </w:r>
+      <w:proofErr w:type="spellEnd"/>
+      <w:r>
+        <w:rPr>
+          <w:rFonts w:ascii="Arial" w:hAnsi="Arial" w:cs="Arial"/>
+          <w:sz w:val="18"/>
+          <w:szCs w:val="18"/>
+          <w:lang w:val="es-ES_tradnl"/>
+        </w:rPr>
+        <w:t xml:space="preserve"> V - SEDE TRUJILLO, OFICINA REGISTRAL DE TRUJILLO</w:t>
       </w:r>
       <w:r>
         <w:rPr>
@@ -388,6 +430,46 @@
       <w:r>
         <w:rPr>
           <w:rFonts w:ascii="Arial" w:hAnsi="Arial" w:cs="Arial"/>
+          <w:bCs/>
+          <w:color w:val="000000"/>
+          <w:sz w:val="18"/>
+          <w:szCs w:val="18"/>
+        </w:rPr>
+        <w:t xml:space="preserve">, </w:t>
+      </w:r>
+      <w:r>
+        <w:rPr>
+          <w:rFonts w:ascii="Arial" w:hAnsi="Arial" w:cs="Arial"/>
+          <w:bCs/>
+          <w:color w:val="000000"/>
+          <w:sz w:val="18"/>
+          <w:szCs w:val="18"/>
+        </w:rPr>
+        <w:t>«</w:t>
+      </w:r>
+      <w:r>
+        <w:rPr>
+          <w:rFonts w:ascii="Arial" w:hAnsi="Arial" w:cs="Arial"/>
+          <w:bCs/>
+          <w:color w:val="000000"/>
+          <w:sz w:val="18"/>
+          <w:szCs w:val="18"/>
+        </w:rPr>
+        <w:t>UBIGEO</w:t>
+      </w:r>
+      <w:r>
+        <w:rPr>
+          <w:rFonts w:ascii="Arial" w:hAnsi="Arial" w:cs="Arial"/>
+          <w:bCs/>
+          <w:color w:val="000000"/>
+          <w:sz w:val="18"/>
+          <w:szCs w:val="18"/>
+        </w:rPr>
+        <w:t>»</w:t>
+      </w:r>
+      <w:r>
+        <w:rPr>
+          <w:rFonts w:ascii="Arial" w:hAnsi="Arial" w:cs="Arial"/>
           <w:sz w:val="18"/>
           <w:szCs w:val="18"/>
         </w:rPr>
@@ -518,7 +600,27 @@
           <w:sz w:val="18"/>
           <w:szCs w:val="18"/>
         </w:rPr>
-        <w:t>PARTIDA ELECTRONICA Nº 11095526</w:t>
+        <w:t xml:space="preserve">PARTIDA ELECTRONICA </w:t>
+      </w:r>
+      <w:proofErr w:type="spellStart"/>
+      <w:r>
+        <w:rPr>
+          <w:rFonts w:ascii="Arial" w:hAnsi="Arial" w:cs="Arial"/>
+          <w:b/>
+          <w:sz w:val="18"/>
+          <w:szCs w:val="18"/>
+        </w:rPr>
+        <w:t>Nº</w:t>
+      </w:r>
+      <w:proofErr w:type="spellEnd"/>
+      <w:r>
+        <w:rPr>
+          <w:rFonts w:ascii="Arial" w:hAnsi="Arial" w:cs="Arial"/>
+          <w:b/>
+          <w:sz w:val="18"/>
+          <w:szCs w:val="18"/>
+        </w:rPr>
+        <w:t xml:space="preserve"> 11095526</w:t>
       </w:r>
       <w:r>
         <w:rPr>
@@ -543,7 +645,25 @@
           <w:sz w:val="18"/>
           <w:szCs w:val="18"/>
         </w:rPr>
-        <w:t>DEL REGISTRO DE PREDIOS DE LA ZONA REGISTRAL Nº V – SEDE TRUJILLO, OFICINA REGISTRAL DE TRUJILLO</w:t>
+        <w:t xml:space="preserve">DEL REGISTRO DE PREDIOS DE LA ZONA REGISTRAL </w:t>
+      </w:r>
+      <w:proofErr w:type="spellStart"/>
+      <w:r>
+        <w:rPr>
+          <w:rFonts w:ascii="Arial" w:hAnsi="Arial" w:cs="Arial"/>
+          <w:sz w:val="18"/>
+          <w:szCs w:val="18"/>
+        </w:rPr>
+        <w:t>Nº</w:t>
+      </w:r>
+      <w:proofErr w:type="spellEnd"/>
+      <w:r>
+        <w:rPr>
+          <w:rFonts w:ascii="Arial" w:hAnsi="Arial" w:cs="Arial"/>
+          <w:sz w:val="18"/>
+          <w:szCs w:val="18"/>
+        </w:rPr>
+        <w:t xml:space="preserve"> V – SEDE TRUJILLO, OFICINA REGISTRAL DE TRUJILLO</w:t>
       </w:r>
       <w:r>
         <w:rPr>
@@ -1153,7 +1273,18 @@
           <w:sz w:val="18"/>
           <w:szCs w:val="18"/>
         </w:rPr>
-        <w:t>«AREA» M2 («AREA_TEXTO» METROS CUADRADOS</w:t>
+        <w:t xml:space="preserve">«AREA» M2 </w:t>
+      </w:r>
+      <w:r>
+        <w:rPr>
+          <w:rFonts w:ascii="Arial" w:hAnsi="Arial" w:cs="Arial"/>
+          <w:b/>
+          <w:bCs/>
+          <w:sz w:val="18"/>
+          <w:szCs w:val="18"/>
+        </w:rPr>
+        <w:lastRenderedPageBreak/>
+        <w:t>(«AREA_TEXTO» METROS CUADRADOS</w:t>
       </w:r>
       <w:r>
         <w:rPr>
@@ -1201,18 +1332,7 @@
           <w:sz w:val="18"/>
           <w:szCs w:val="18"/>
         </w:rPr>
-        <w:t xml:space="preserve">RESIDENCIAL LOS </w:t>
-      </w:r>
-      <w:r>
-        <w:rPr>
-          <w:rFonts w:ascii="Arial" w:hAnsi="Arial" w:cs="Arial"/>
-          <w:b/>
-          <w:bCs/>
-          <w:sz w:val="18"/>
-          <w:szCs w:val="18"/>
-        </w:rPr>
-        <w:lastRenderedPageBreak/>
-        <w:t>LAURELES DE CASTILLA</w:t>
+        <w:t>RESIDENCIAL LOS LAURELES DE CASTILLA</w:t>
       </w:r>
       <w:r>
         <w:rPr>
@@ -1270,14 +1390,25 @@
         </w:rPr>
         <w:t xml:space="preserve">, POR LA SUMA TOTAL DE </w:t>
       </w:r>
-      <w:r>
-        <w:rPr>
-          <w:rFonts w:ascii="Arial" w:hAnsi="Arial" w:cs="Arial"/>
-          <w:b/>
-          <w:sz w:val="18"/>
-          <w:szCs w:val="18"/>
-        </w:rPr>
-        <w:t>DE US$«PRECIO» («PRECIO_TEXTO» Y «PRECIO_</w:t>
+      <w:proofErr w:type="spellStart"/>
+      <w:r>
+        <w:rPr>
+          <w:rFonts w:ascii="Arial" w:hAnsi="Arial" w:cs="Arial"/>
+          <w:b/>
+          <w:sz w:val="18"/>
+          <w:szCs w:val="18"/>
+        </w:rPr>
+        <w:t>DE</w:t>
+      </w:r>
+      <w:proofErr w:type="spellEnd"/>
+      <w:r>
+        <w:rPr>
+          <w:rFonts w:ascii="Arial" w:hAnsi="Arial" w:cs="Arial"/>
+          <w:b/>
+          <w:sz w:val="18"/>
+          <w:szCs w:val="18"/>
+        </w:rPr>
+        <w:t xml:space="preserve"> US$«PRECIO» («PRECIO_TEXTO» Y «PRECIO_</w:t>
       </w:r>
       <w:proofErr w:type="gramStart"/>
       <w:r>
@@ -2218,6 +2349,7 @@
           <w:sz w:val="18"/>
           <w:szCs w:val="18"/>
         </w:rPr>
+        <w:lastRenderedPageBreak/>
         <w:t>SEXTA</w:t>
       </w:r>
       <w:r>
@@ -2375,7 +2507,6 @@
           <w:sz w:val="18"/>
           <w:szCs w:val="18"/>
         </w:rPr>
-        <w:lastRenderedPageBreak/>
         <w:t xml:space="preserve">- </w:t>
       </w:r>
       <w:r>
@@ -2418,31 +2549,15 @@
           <w:sz w:val="18"/>
           <w:szCs w:val="18"/>
         </w:rPr>
-        <w:t>«</w:t>
-      </w:r>
-      <w:r>
-        <w:rPr>
-          <w:rFonts w:ascii="Arial" w:hAnsi="Arial" w:cs="Arial"/>
-          <w:sz w:val="18"/>
-          <w:szCs w:val="18"/>
-        </w:rPr>
-        <w:t>COMPRADOR</w:t>
-      </w:r>
-      <w:r>
-        <w:rPr>
-          <w:rFonts w:ascii="Arial" w:hAnsi="Arial" w:cs="Arial"/>
-          <w:sz w:val="18"/>
-          <w:szCs w:val="18"/>
-        </w:rPr>
-        <w:t>»</w:t>
-      </w:r>
-      <w:r>
-        <w:rPr>
-          <w:rFonts w:ascii="Arial" w:hAnsi="Arial" w:cs="Arial"/>
-          <w:sz w:val="18"/>
-          <w:szCs w:val="18"/>
-        </w:rPr>
-        <w:t xml:space="preserve">, UNA VEZ REALIZADA LA INDEPENDIZACIÓN DE EL INMUEBLE OBJETO DEL PRESENTE CONTRATO EN EL REGISTRO PÚBLICO PERTINENTE, Y TOTALMENTE SANEADO, PARA CUYOS EFECTOS, LAS PARTES ACUERDAN </w:t>
+        <w:t xml:space="preserve">«COMPRADOR», «MODALIDAD_ENTREGA», PARA </w:t>
+      </w:r>
+      <w:r>
+        <w:rPr>
+          <w:rFonts w:ascii="Arial" w:hAnsi="Arial" w:cs="Arial"/>
+          <w:sz w:val="18"/>
+          <w:szCs w:val="18"/>
+        </w:rPr>
+        <w:t xml:space="preserve">CUYOS EFECTOS, LAS PARTES ACUERDAN </w:t>
       </w:r>
       <w:r>
         <w:rPr>
@@ -3373,7 +3488,6 @@
           <w:sz w:val="18"/>
           <w:szCs w:val="18"/>
         </w:rPr>
-        <w:lastRenderedPageBreak/>
         <w:t>DECIM</w:t>
       </w:r>
       <w:r>
@@ -3444,6 +3558,7 @@
           <w:sz w:val="18"/>
           <w:szCs w:val="18"/>
         </w:rPr>
+        <w:lastRenderedPageBreak/>
         <w:t xml:space="preserve">PARA EFECTOS DE CUALQUIER CONTROVERSIA QUE SE GENERE CON MOTIVO DE LA CELEBRACIÓN Y EJECUCIÓN DEL PRESENTE CONTRATO, LAS PARTES SE SOMETEN A LA COMPETENCIA TERRITORIAL DE LOS JUECES Y TRIBUNALES DE LA CIUDAD DE TRUJILLO, SEÑALANDO COMO SUS DOMICILIOS LOS CONSIGNADOS EN LAS ESPECIFICACIONES GENERALES DEL PRESENTE DOCUMENTO, EN DONDE SE LES HARÁ LLEGAR TODAS LAS COMUNICACIONES RELACIONADAS CON ESTE CONTRATO. EL CAMBIO DE DOMICILIO DE CUALQUIERA DE LAS PARTES SURTIRÁ EFECTO RESPECTO DE LA OTRA DESDE LA FECHA EN QUE SE LE COMUNIQUE NOTARIALMENTE DICHO CAMBIO. </w:t>
       </w:r>
     </w:p>

</xml_diff>